<commit_message>
Se actualizó la CV, y las redes sociales pasaron al bloque de contacto
</commit_message>
<xml_diff>
--- a/static/CV_Kevin_Olivella_ATS.docx
+++ b/static/CV_Kevin_Olivella_ATS.docx
@@ -14,6 +14,7 @@
           <w:lang w:val="es-CO"/>
         </w:rPr>
       </w:pPr>
+      <w:bookmarkStart w:id="0" w:name="_Hlk200286876"/>
       <w:r>
         <w:rPr>
           <w:rFonts w:ascii="Arial" w:hAnsi="Arial" w:cs="Arial"/>
@@ -217,6 +218,7 @@
         <w:t>https://portafoliokevinolivella.netlify.app/#inicio</w:t>
       </w:r>
     </w:p>
+    <w:bookmarkEnd w:id="0"/>
     <w:p>
       <w:pPr>
         <w:pStyle w:val="Ttulo2"/>
@@ -395,6 +397,7 @@
     <w:p>
       <w:pPr>
         <w:pStyle w:val="Ttulo2"/>
+        <w:jc w:val="center"/>
         <w:rPr>
           <w:rFonts w:ascii="Arial" w:hAnsi="Arial" w:cs="Arial"/>
           <w:lang w:val="es-CO"/>
@@ -407,6 +410,13 @@
         </w:rPr>
         <w:t>Formación Académica</w:t>
       </w:r>
+    </w:p>
+    <w:p>
+      <w:pPr>
+        <w:rPr>
+          <w:lang w:val="es-CO"/>
+        </w:rPr>
+      </w:pPr>
     </w:p>
     <w:p>
       <w:pPr>
@@ -564,6 +574,7 @@
     <w:p>
       <w:pPr>
         <w:pStyle w:val="Ttulo2"/>
+        <w:jc w:val="center"/>
         <w:rPr>
           <w:rFonts w:ascii="Arial" w:hAnsi="Arial" w:cs="Arial"/>
           <w:lang w:val="es-CO"/>
@@ -583,6 +594,18 @@
         </w:rPr>
         <w:t>:</w:t>
       </w:r>
+    </w:p>
+    <w:p>
+      <w:pPr>
+        <w:spacing w:line="240" w:lineRule="auto"/>
+        <w:contextualSpacing/>
+        <w:rPr>
+          <w:rFonts w:ascii="Arial" w:hAnsi="Arial" w:cs="Arial"/>
+          <w:b/>
+          <w:bCs/>
+          <w:lang w:val="es-CO"/>
+        </w:rPr>
+      </w:pPr>
     </w:p>
     <w:p>
       <w:pPr>
@@ -797,12 +820,6 @@
           <w:lang w:val="es-CO"/>
         </w:rPr>
         <w:br/>
-      </w:r>
-      <w:r>
-        <w:rPr>
-          <w:rFonts w:ascii="Arial" w:hAnsi="Arial" w:cs="Arial"/>
-          <w:lang w:val="es-CO"/>
-        </w:rPr>
         <w:t xml:space="preserve">- Base de datos MySQL, </w:t>
       </w:r>
       <w:proofErr w:type="spellStart"/>
@@ -850,6 +867,7 @@
           <w:bCs/>
           <w:lang w:val="es-CO"/>
         </w:rPr>
+        <w:lastRenderedPageBreak/>
         <w:t>App Usuarios</w:t>
       </w:r>
       <w:r>
@@ -934,6 +952,7 @@
       <w:pPr>
         <w:rPr>
           <w:rFonts w:ascii="Arial" w:hAnsi="Arial" w:cs="Arial"/>
+          <w:u w:val="single"/>
           <w:lang w:val="es-CO"/>
         </w:rPr>
       </w:pPr>
@@ -942,29 +961,76 @@
           <w:rFonts w:ascii="Arial" w:hAnsi="Arial" w:cs="Arial"/>
           <w:lang w:val="es-CO"/>
         </w:rPr>
-        <w:t>Proyecto en Angular 19</w:t>
+        <w:t xml:space="preserve">Aplicación SPA desarrollada en Angular que permite buscar información de países en tiempo real. </w:t>
+      </w:r>
+      <w:proofErr w:type="spellStart"/>
+      <w:r>
+        <w:rPr>
+          <w:rFonts w:ascii="Arial" w:hAnsi="Arial" w:cs="Arial"/>
+        </w:rPr>
+        <w:t>Tecnologías</w:t>
+      </w:r>
+      <w:proofErr w:type="spellEnd"/>
+      <w:r>
+        <w:rPr>
+          <w:rFonts w:ascii="Arial" w:hAnsi="Arial" w:cs="Arial"/>
+        </w:rPr>
+        <w:t xml:space="preserve">: Angular 19, </w:t>
+      </w:r>
+      <w:proofErr w:type="spellStart"/>
+      <w:r>
+        <w:rPr>
+          <w:rFonts w:ascii="Arial" w:hAnsi="Arial" w:cs="Arial"/>
+        </w:rPr>
+        <w:t>DaisyUI</w:t>
+      </w:r>
+      <w:proofErr w:type="spellEnd"/>
+      <w:r>
+        <w:rPr>
+          <w:rFonts w:ascii="Arial" w:hAnsi="Arial" w:cs="Arial"/>
+        </w:rPr>
+        <w:t xml:space="preserve">, </w:t>
+      </w:r>
+      <w:proofErr w:type="spellStart"/>
+      <w:r>
+        <w:rPr>
+          <w:rFonts w:ascii="Arial" w:hAnsi="Arial" w:cs="Arial"/>
+        </w:rPr>
+        <w:t>TailwindCSS</w:t>
+      </w:r>
+      <w:proofErr w:type="spellEnd"/>
+      <w:r>
+        <w:rPr>
+          <w:rFonts w:ascii="Arial" w:hAnsi="Arial" w:cs="Arial"/>
+        </w:rPr>
+        <w:t xml:space="preserve">, </w:t>
+      </w:r>
+      <w:proofErr w:type="spellStart"/>
+      <w:r>
+        <w:rPr>
+          <w:rFonts w:ascii="Arial" w:hAnsi="Arial" w:cs="Arial"/>
+        </w:rPr>
+        <w:t>Consumo</w:t>
+      </w:r>
+      <w:proofErr w:type="spellEnd"/>
+      <w:r>
+        <w:rPr>
+          <w:rFonts w:ascii="Arial" w:hAnsi="Arial" w:cs="Arial"/>
+        </w:rPr>
+        <w:t xml:space="preserve"> de API REST.</w:t>
       </w:r>
     </w:p>
     <w:p>
       <w:pPr>
         <w:rPr>
           <w:rFonts w:ascii="Arial" w:hAnsi="Arial" w:cs="Arial"/>
-          <w:u w:val="single"/>
-          <w:lang w:val="es-CO"/>
-        </w:rPr>
-      </w:pPr>
-    </w:p>
-    <w:p>
-      <w:pPr>
-        <w:rPr>
-          <w:rFonts w:ascii="Arial" w:hAnsi="Arial" w:cs="Arial"/>
           <w:lang w:val="es-CO"/>
         </w:rPr>
         <w:sectPr>
           <w:type w:val="continuous"/>
           <w:pgSz w:w="12240" w:h="15840"/>
           <w:pgMar w:top="1440" w:right="1800" w:bottom="1440" w:left="1800" w:header="720" w:footer="720" w:gutter="0"/>
-          <w:cols w:num="2" w:space="720"/>
+          <w:cols w:space="720"/>
           <w:docGrid w:linePitch="360"/>
         </w:sectPr>
       </w:pPr>
@@ -982,7 +1048,6 @@
           <w:rFonts w:ascii="Arial" w:hAnsi="Arial" w:cs="Arial"/>
           <w:lang w:val="es-CO"/>
         </w:rPr>
-        <w:lastRenderedPageBreak/>
         <w:t>Idiomas</w:t>
       </w:r>
     </w:p>
@@ -990,7 +1055,6 @@
       <w:pPr>
         <w:rPr>
           <w:rFonts w:ascii="Arial" w:hAnsi="Arial" w:cs="Arial"/>
-          <w:u w:val="single"/>
           <w:lang w:val="es-CO"/>
         </w:rPr>
       </w:pPr>
@@ -1051,206 +1115,6 @@
     </w:p>
     <w:p>
       <w:pPr>
-        <w:rPr>
-          <w:rFonts w:ascii="Arial" w:hAnsi="Arial" w:cs="Arial"/>
-          <w:lang w:val="es-CO"/>
-        </w:rPr>
-      </w:pPr>
-    </w:p>
-    <w:p>
-      <w:pPr>
-        <w:rPr>
-          <w:rFonts w:ascii="Arial" w:hAnsi="Arial" w:cs="Arial"/>
-          <w:lang w:val="es-CO"/>
-        </w:rPr>
-      </w:pPr>
-    </w:p>
-    <w:p>
-      <w:pPr>
-        <w:rPr>
-          <w:rFonts w:ascii="Arial" w:hAnsi="Arial" w:cs="Arial"/>
-          <w:lang w:val="es-CO"/>
-        </w:rPr>
-      </w:pPr>
-    </w:p>
-    <w:p>
-      <w:pPr>
-        <w:rPr>
-          <w:rFonts w:ascii="Arial" w:hAnsi="Arial" w:cs="Arial"/>
-          <w:lang w:val="es-CO"/>
-        </w:rPr>
-      </w:pPr>
-    </w:p>
-    <w:p>
-      <w:pPr>
-        <w:rPr>
-          <w:rFonts w:ascii="Arial" w:hAnsi="Arial" w:cs="Arial"/>
-          <w:lang w:val="es-CO"/>
-        </w:rPr>
-      </w:pPr>
-    </w:p>
-    <w:p>
-      <w:pPr>
-        <w:rPr>
-          <w:rFonts w:ascii="Arial" w:hAnsi="Arial" w:cs="Arial"/>
-          <w:lang w:val="es-CO"/>
-        </w:rPr>
-      </w:pPr>
-    </w:p>
-    <w:p>
-      <w:pPr>
-        <w:rPr>
-          <w:rFonts w:ascii="Arial" w:hAnsi="Arial" w:cs="Arial"/>
-          <w:lang w:val="es-CO"/>
-        </w:rPr>
-      </w:pPr>
-    </w:p>
-    <w:p>
-      <w:pPr>
-        <w:rPr>
-          <w:rFonts w:ascii="Arial" w:hAnsi="Arial" w:cs="Arial"/>
-          <w:lang w:val="es-CO"/>
-        </w:rPr>
-      </w:pPr>
-    </w:p>
-    <w:p>
-      <w:pPr>
-        <w:rPr>
-          <w:rFonts w:ascii="Arial" w:hAnsi="Arial" w:cs="Arial"/>
-          <w:lang w:val="es-CO"/>
-        </w:rPr>
-      </w:pPr>
-    </w:p>
-    <w:p>
-      <w:pPr>
-        <w:rPr>
-          <w:rFonts w:ascii="Arial" w:hAnsi="Arial" w:cs="Arial"/>
-          <w:lang w:val="es-CO"/>
-        </w:rPr>
-      </w:pPr>
-    </w:p>
-    <w:p>
-      <w:pPr>
-        <w:rPr>
-          <w:rFonts w:ascii="Arial" w:hAnsi="Arial" w:cs="Arial"/>
-          <w:lang w:val="es-CO"/>
-        </w:rPr>
-      </w:pPr>
-    </w:p>
-    <w:p>
-      <w:pPr>
-        <w:rPr>
-          <w:rFonts w:ascii="Arial" w:hAnsi="Arial" w:cs="Arial"/>
-          <w:lang w:val="es-CO"/>
-        </w:rPr>
-      </w:pPr>
-    </w:p>
-    <w:p>
-      <w:pPr>
-        <w:rPr>
-          <w:rFonts w:ascii="Arial" w:hAnsi="Arial" w:cs="Arial"/>
-          <w:lang w:val="es-CO"/>
-        </w:rPr>
-      </w:pPr>
-    </w:p>
-    <w:p>
-      <w:pPr>
-        <w:rPr>
-          <w:rFonts w:ascii="Arial" w:hAnsi="Arial" w:cs="Arial"/>
-          <w:lang w:val="es-CO"/>
-        </w:rPr>
-      </w:pPr>
-    </w:p>
-    <w:p>
-      <w:pPr>
-        <w:rPr>
-          <w:rFonts w:ascii="Arial" w:hAnsi="Arial" w:cs="Arial"/>
-          <w:lang w:val="es-CO"/>
-        </w:rPr>
-      </w:pPr>
-    </w:p>
-    <w:p>
-      <w:pPr>
-        <w:rPr>
-          <w:rFonts w:ascii="Arial" w:hAnsi="Arial" w:cs="Arial"/>
-          <w:lang w:val="es-CO"/>
-        </w:rPr>
-      </w:pPr>
-    </w:p>
-    <w:p>
-      <w:pPr>
-        <w:rPr>
-          <w:rFonts w:ascii="Arial" w:hAnsi="Arial" w:cs="Arial"/>
-          <w:lang w:val="es-CO"/>
-        </w:rPr>
-      </w:pPr>
-    </w:p>
-    <w:p>
-      <w:pPr>
-        <w:rPr>
-          <w:rFonts w:ascii="Arial" w:hAnsi="Arial" w:cs="Arial"/>
-          <w:lang w:val="es-CO"/>
-        </w:rPr>
-      </w:pPr>
-    </w:p>
-    <w:p>
-      <w:pPr>
-        <w:rPr>
-          <w:rFonts w:ascii="Arial" w:hAnsi="Arial" w:cs="Arial"/>
-          <w:lang w:val="es-CO"/>
-        </w:rPr>
-      </w:pPr>
-    </w:p>
-    <w:p>
-      <w:pPr>
-        <w:rPr>
-          <w:rFonts w:ascii="Arial" w:hAnsi="Arial" w:cs="Arial"/>
-          <w:lang w:val="es-CO"/>
-        </w:rPr>
-      </w:pPr>
-    </w:p>
-    <w:p>
-      <w:pPr>
-        <w:rPr>
-          <w:rFonts w:ascii="Arial" w:hAnsi="Arial" w:cs="Arial"/>
-          <w:lang w:val="es-CO"/>
-        </w:rPr>
-      </w:pPr>
-    </w:p>
-    <w:p>
-      <w:pPr>
-        <w:rPr>
-          <w:rFonts w:ascii="Arial" w:hAnsi="Arial" w:cs="Arial"/>
-          <w:lang w:val="es-CO"/>
-        </w:rPr>
-      </w:pPr>
-    </w:p>
-    <w:p>
-      <w:pPr>
-        <w:rPr>
-          <w:rFonts w:ascii="Arial" w:hAnsi="Arial" w:cs="Arial"/>
-          <w:lang w:val="es-CO"/>
-        </w:rPr>
-      </w:pPr>
-    </w:p>
-    <w:p>
-      <w:pPr>
-        <w:rPr>
-          <w:rFonts w:ascii="Arial" w:hAnsi="Arial" w:cs="Arial"/>
-          <w:lang w:val="es-CO"/>
-        </w:rPr>
-      </w:pPr>
-    </w:p>
-    <w:p>
-      <w:pPr>
-        <w:rPr>
-          <w:rFonts w:ascii="Arial" w:hAnsi="Arial" w:cs="Arial"/>
-          <w:lang w:val="es-CO"/>
-        </w:rPr>
-      </w:pPr>
-    </w:p>
-    <w:p>
-      <w:pPr>
         <w:pStyle w:val="Ttulo2"/>
         <w:rPr>
           <w:rFonts w:ascii="Arial" w:hAnsi="Arial" w:cs="Arial"/>
@@ -1278,14 +1142,6 @@
           <w:lang w:val="es-CO"/>
         </w:rPr>
         <w:t>- Disponibilidad inmediata</w:t>
-      </w:r>
-      <w:r>
-        <w:rPr>
-          <w:rFonts w:ascii="Arial" w:hAnsi="Arial" w:cs="Arial"/>
-          <w:lang w:val="es-CO"/>
-        </w:rPr>
-        <w:br/>
-        <w:t>- Interés en primer empleo en desarrollo web</w:t>
       </w:r>
       <w:r>
         <w:rPr>
@@ -1300,7 +1156,7 @@
       <w:type w:val="continuous"/>
       <w:pgSz w:w="12240" w:h="15840"/>
       <w:pgMar w:top="720" w:right="720" w:bottom="720" w:left="720" w:header="720" w:footer="720" w:gutter="0"/>
-      <w:cols w:num="2" w:space="720"/>
+      <w:cols w:space="720"/>
       <w:docGrid w:linePitch="360"/>
     </w:sectPr>
   </w:body>
@@ -2181,7 +2037,6 @@
   <w:style w:type="character" w:default="1" w:styleId="Fuentedeprrafopredeter">
     <w:name w:val="Default Paragraph Font"/>
     <w:uiPriority w:val="1"/>
-    <w:semiHidden/>
     <w:unhideWhenUsed/>
   </w:style>
   <w:style w:type="table" w:default="1" w:styleId="Tablanormal">

</xml_diff>